<commit_message>
Complete native model deployment and Desktop verification
Finish native GGUF acquisition, automatic placement, bundled runtime discovery, process ownership, and load/stop state handling. Repair onboarding and nested-dialog keyboard behavior, clarify model recovery, and reconcile documentation with the native product direction.

Validated real download, load, completed chat, and stop workflows in source and packaged builds. Installed Desktop was updated and verified; native regressions, documentation checks, and repository safety checks passed.
</commit_message>
<xml_diff>
--- a/docs/RASPUTIN_PERSONAL_ASSISTANT_EVOLUTION_PROPOSAL.docx
+++ b/docs/RASPUTIN_PERSONAL_ASSISTANT_EVOLUTION_PROPOSAL.docx
@@ -222,7 +222,7 @@
                 <w:color w:val="111827"/>
                 <w:sz w:val="21"/>
               </w:rPr>
-              <w:t>This is a design document only. It proposes an evolution path, contracts, milestones, and decisions for approval. It does not change Rasputin source code, download models, alter Docker instances, commit files, or enable autonomous actions. It also does not grant any model runtime generic API access to the host computer.</w:t>
+              <w:t>This is a design document only. It proposes an evolution path, contracts, milestones, and decisions for approval. It does not change Rasputin source code, download models, alter native runtimes, commit files, or enable autonomous actions. It also does not grant any model runtime generic API access to the host computer.</w:t>
             </w:r>
           </w:p>
         </w:tc>
@@ -275,7 +275,7 @@
           <w:color w:val="111827"/>
           <w:sz w:val="22"/>
         </w:rPr>
-        <w:t>Rasputin should be able to understand approved context from across chats and workspaces, then turn a natural request into a governed plan. It can delegate to registered agents, stream their status, ask for approvals, and summarize their results. A local control broker may open VS Code, run tests, inspect files, or operate Docker, but model containers receive only scoped requests and structured receipts, never generic access to the personal computer.</w:t>
+        <w:t>Rasputin should be able to understand approved context from across chats and workspaces, then turn a natural request into a governed plan. It can delegate to registered agents, stream their status, ask for approvals, and summarize their results. A local control broker may open VS Code, run tests, inspect files, or load models, but model processes receive only scoped requests and structured receipts, never generic access to the personal computer.</w:t>
       </w:r>
     </w:p>
     <w:p>
@@ -1047,7 +1047,7 @@
           <w:color w:val="111827"/>
           <w:sz w:val="22"/>
         </w:rPr>
-        <w:t>The existing codebase already provides the main seams needed for this direction: WarSat deploys managed runtimes, the model registry exposes role-based routing, providers normalize model I/O, the governed agent loop executes tasks, MCP tools enforce approvals, and memory remains workspace-aware. The proposal adds typed capabilities, fleet-level lifecycle, audio adapters, a persistent Rasputin context layer, and a local agent-control boundary around those seams.</w:t>
+        <w:t>The existing codebase already provides the main seams needed for this direction: llama.cpp runs managed runtimes, the model registry exposes role-based routing, providers normalize model I/O, the governed agent loop executes tasks, MCP tools enforce approvals, and memory remains workspace-aware. The proposal adds typed capabilities, fleet-level lifecycle, audio adapters, a persistent Rasputin context layer, and a local agent-control boundary around those seams.</w:t>
       </w:r>
     </w:p>
     <w:tbl>
@@ -1216,7 +1216,7 @@
                 <w:color w:val="111827"/>
                 <w:sz w:val="19"/>
               </w:rPr>
-              <w:t>WarSat plans and launches one managed model at a time.</w:t>
+              <w:t>Native llama.cpp loads one managed model at a time.</w:t>
             </w:r>
           </w:p>
         </w:tc>
@@ -1521,7 +1521,7 @@
                 <w:color w:val="111827"/>
                 <w:sz w:val="19"/>
               </w:rPr>
-              <w:t>A local control broker handles VS Code, shell, tests, Docker, and other host actions; model runtimes receive scoped work requests and structured results only.</w:t>
+              <w:t>A local control broker handles VS Code, shell, tests, and other approved host actions; model runtimes receive scoped work requests and structured results only.</w:t>
             </w:r>
           </w:p>
         </w:tc>
@@ -1721,7 +1721,7 @@
                 <w:color w:val="111827"/>
                 <w:sz w:val="21"/>
               </w:rPr>
-              <w:t>Rasputin may orchestrate local actions through a broker that exposes narrow capabilities such as opening VS Code, running a named test command, reading an approved workspace, or starting a Docker operation. Model containers do not receive generic host APIs, host filesystem access, credentials, keyboard/mouse control, or unrestricted network access. They return plans and structured results to Rasputin; the local broker enforces scope, approval, and audit.</w:t>
+              <w:t>Rasputin may orchestrate local actions through a broker that exposes narrow capabilities such as opening VS Code, running a named test command, reading an approved workspace, or loading a local model. Model processes do not receive generic host APIs, host filesystem access, credentials, keyboard/mouse control, or unrestricted network access. They return plans and structured results to Rasputin; the local broker enforces scope, approval, and audit.</w:t>
             </w:r>
           </w:p>
         </w:tc>
@@ -1810,7 +1810,7 @@
           <w:color w:val="111827"/>
           <w:sz w:val="22"/>
         </w:rPr>
-        <w:t>The first practical step toward the assistant objective is to make multiple model and agent launches feel like installing one coherent local capability set. The operator should not need to understand ports, container names, GPU selectors, context flags, or runtime-specific arguments for every worker. Rasputin should present one pack, one plan, one status view, and one recovery story.</w:t>
+        <w:t>The first practical step toward the assistant objective is to make multiple model and agent launches feel like installing one coherent local capability set. The operator should not need to understand ports, process names, GPU selectors, context flags, or runtime-specific arguments for every worker. Rasputin should present one pack, one plan, one status view, and one recovery story.</w:t>
       </w:r>
     </w:p>
     <w:p>
@@ -2754,7 +2754,7 @@
           <w:color w:val="111827"/>
           <w:sz w:val="22"/>
         </w:rPr>
-        <w:t>3.   The fleet planner rejects unsafe or impossible combinations before any container starts.</w:t>
+        <w:t>3.   The fleet planner rejects unsafe or impossible combinations before any model starts.</w:t>
       </w:r>
     </w:p>
     <w:p>
@@ -4339,7 +4339,7 @@
           <w:color w:val="111827"/>
           <w:sz w:val="22"/>
         </w:rPr>
-        <w:t>The computer bridge is a local process boundary, not an API model capability. The broker can expose narrow operations such as open VS Code, run a named test command, inspect an approved workspace, or start a Docker action. It should use allowlists, scoped credentials, dry-run previews, emergency stop, and complete receipts. Models only receive the minimum task input and structured output required for their role.</w:t>
+        <w:t>The computer bridge is a local process boundary, not an API model capability. The broker can expose narrow operations such as open VS Code, run a named test command, inspect an approved workspace, or load a local model. It should use allowlists, scoped credentials, dry-run previews, emergency stop, and complete receipts. Models only receive the minimum task input and structured output required for their role.</w:t>
       </w:r>
     </w:p>
     <w:tbl>
@@ -4399,7 +4399,7 @@
                 <w:color w:val="111827"/>
                 <w:sz w:val="21"/>
               </w:rPr>
-              <w:t>Rasputin is the authority and user-facing personality. Agents and model containers are workers. The local broker is the only component allowed to turn an approved plan into host-computer effects, and every mutation remains subject to the existing Rasputin approval and audit rules.</w:t>
+              <w:t>Rasputin is the authority and user-facing personality. Agents and model processes are workers. The local broker is the only component allowed to turn an approved plan into host-computer effects, and every mutation remains subject to the existing Rasputin approval and audit rules.</w:t>
             </w:r>
           </w:p>
         </w:tc>
@@ -9368,7 +9368,7 @@
                 <w:color w:val="111827"/>
                 <w:sz w:val="17"/>
               </w:rPr>
-              <w:t>Remain the authority for filesystem, shell, Docker, network, local computer broker, and future device actions.</w:t>
+              <w:t>Remain the authority for filesystem, approved shell, network, local computer broker, and future device actions.</w:t>
             </w:r>
           </w:p>
         </w:tc>

</xml_diff>